<commit_message>
Critically re-evaluate every programme deep-dive for analytical honesty
- Correct the over-claim that points programmes are 'beyond discounting':
  spell out that points-for-money-off is a deferred, conditional rebate
- Separate the transactional points core from the non-points wrapper
  (status/community/gifting) that actually builds emotional attachment
- Qualify the 'first-party data' benefit: real for offline/multi-brand,
  weak for a D2C brand that already captures online accounts
- Add the physical-product COGS lens (a free case is real cost, unlike a
  hotel upgrade or digital drop) to every 'what works' / 'lesson' row
- Rewrite Objectives/Consumer-psychology/What-works/Lesson for all 10
  global programmes; add a 'How to read these deep-dives' framing note

Co-Authored-By: Claude Opus 4.8 <noreply@anthropic.com>
Claude-Session: https://claude.ai/code/session_01H42f9onhzyUUMa7YSHdZFA
</commit_message>
<xml_diff>
--- a/DailyObjects_Loyalty_Strategy.docx
+++ b/DailyObjects_Loyalty_Strategy.docx
@@ -230,7 +230,7 @@
           <w:sz w:val="21"/>
           <w:szCs w:val="21"/>
         </w:rPr>
-        <w:t>not the points liability (Nike ~400M members; Sephora members = ~80% of transactions).</w:t>
+        <w:t>not the points liability (Nike ~400M members; Sephora members = ~80% of transactions) — though for a D2C brand that already captures online accounts, that prize is specifically in-store identity and preference enrichment, not basic transaction capture.</w:t>
       </w:r>
     </w:p>
     <w:p>
@@ -9822,6 +9822,56 @@
     </w:p>
     <w:p>
       <w:pPr>
+        <w:spacing w:after="160"/>
+      </w:pPr>
+      <w:r>
+        <w:rPr>
+          <w:rFonts w:ascii="Calibri" w:hAnsi="Calibri"/>
+          <w:b/>
+          <w:color w:val="2B2B2B"/>
+          <w:sz w:val="21"/>
+        </w:rPr>
+        <w:t xml:space="preserve">How to read these deep-dives — four honest lenses. </w:t>
+      </w:r>
+      <w:r>
+        <w:rPr>
+          <w:rFonts w:ascii="Calibri" w:hAnsi="Calibri"/>
+          <w:b w:val="0"/>
+          <w:color w:val="2B2B2B"/>
+          <w:sz w:val="21"/>
+        </w:rPr>
+        <w:t xml:space="preserve">(1) Most points schemes are a deferred, conditional discount: earning ~1–2% back to redeem later is economically a rebate; the only difference from a plain markdown is behavioural (deferral creates a switching cost), not that it stops being margin given away. </w:t>
+      </w:r>
+      <w:r>
+        <w:rPr>
+          <w:rFonts w:ascii="Calibri" w:hAnsi="Calibri"/>
+          <w:b w:val="0"/>
+          <w:color w:val="2B2B2B"/>
+          <w:sz w:val="21"/>
+        </w:rPr>
+        <w:t xml:space="preserve">(2) Emotional attachment is almost never built by the points — it is built by the non-points wrapper: status/tiers, community, recognition, gifting and experiences. </w:t>
+      </w:r>
+      <w:r>
+        <w:rPr>
+          <w:rFonts w:ascii="Calibri" w:hAnsi="Calibri"/>
+          <w:b w:val="0"/>
+          <w:color w:val="2B2B2B"/>
+          <w:sz w:val="21"/>
+        </w:rPr>
+        <w:t xml:space="preserve">(3) The "first-party data" prize is real only where transactions would otherwise be anonymous or fragmented — strong for multi-brand, store-heavy retailers, weak for a D2C brand that already captures every online account (its data prize is in-store identity and preference enrichment). </w:t>
+      </w:r>
+      <w:r>
+        <w:rPr>
+          <w:rFonts w:ascii="Calibri" w:hAnsi="Calibri"/>
+          <w:b w:val="0"/>
+          <w:color w:val="2B2B2B"/>
+          <w:sz w:val="21"/>
+        </w:rPr>
+        <w:t>(4) Every reward a physical-product brand gives is real COGS — unlike a hotel upgrade or a digital drop — so what a brand can afford to reward with is decisive. Each programme below is judged against these lenses and the tenets in Section 3.</w:t>
+      </w:r>
+    </w:p>
+    <w:p>
+      <w:pPr>
         <w:pStyle w:val="3"/>
         <w:spacing w:before="240" w:after="90"/>
       </w:pPr>
@@ -10093,7 +10143,7 @@
                 <w:sz w:val="18"/>
                 <w:szCs w:val="18"/>
               </w:rPr>
-              <w:t>Own first-party beauty data; drive frequency and trade-up (VIB→Rouge); build emotional attachment beyond discounting.</w:t>
+              <w:t>Be honest about the core: 500 pts = $10 on 1 pt/$1 is a ~2% deferred rebate — economically a discount, just conditional on returning to redeem. The genuine non-discount objectives sit in the wrapper: resolve identity and contactability across store, .com and app (turning otherwise-anonymous or fragmented transactions into one reachable profile — real for a multi-brand, store-heavy retailer); trade customers up to VIB/Rouge; and steer redemption into Bazaar exclusives rather than cash.</w:t>
             </w:r>
           </w:p>
         </w:tc>
@@ -10211,7 +10261,7 @@
                 <w:sz w:val="18"/>
                 <w:szCs w:val="18"/>
               </w:rPr>
-              <w:t>Loss aversion drives tier re-qualification (VIB/Rouge holders spend to keep status); the Rewards Bazaar taps “earning the right to indulge” — points buy hedonic beauty treats, not cash; goal-gradient accelerates spend near a tier; accumulated points feel owned (endowment).</w:t>
+              <w:t>The points core works through deferral, not emotion: goal-gradient and sunk cost make the rebate conditional on return — a switching cost a plain discount lacks. Emotional pull comes only from the tier layer — loss aversion on Rouge status, esteem/identity and community belonging — never from the points themselves.</w:t>
             </w:r>
           </w:p>
         </w:tc>
@@ -10269,7 +10319,7 @@
                 <w:sz w:val="18"/>
                 <w:szCs w:val="18"/>
               </w:rPr>
-              <w:t>Recognition over discount (status + a redemption marketplace priced above cash protects margin); community adds emotional &amp; belonging value; simple 1pt/$1 mechanics; data is the real ROI (~80% of transactions identified).</w:t>
+              <w:t>A transactional rebate wrapped in non-transactional value. Alone, the points are undifferentiated discounting; tiers (status), the Bazaar (exclusives priced above cash to divert redemption away from cash-back), birthday gifts and the community forum are what protect margin and build attachment. Recognition-over-discount applies to the wrapper, not the earn.</w:t>
             </w:r>
           </w:p>
         </w:tc>
@@ -10331,7 +10381,7 @@
                 <w:sz w:val="18"/>
                 <w:szCs w:val="18"/>
               </w:rPr>
-              <w:t>Tiered thresholds + a redemption marketplace priced ABOVE cash trains members to redeem for brand-enhancing product/experiences (protecting margin), and the community layer converts transactions into identity.</w:t>
+              <w:t>Don’t mistake the points for the magic — they are a rebate. If DailyObjects uses points, wrap them in status, exclusives and community and steer redemption toward product/experiences, not cash. And discount the "builds data" claim: as a D2C brand DailyObjects already captures every online account — the identity prize is specifically in-store and in preference enrichment, not basic transaction capture.</w:t>
             </w:r>
           </w:p>
         </w:tc>
@@ -10615,7 +10665,7 @@
                 <w:sz w:val="18"/>
                 <w:szCs w:val="18"/>
               </w:rPr>
-              <w:t>Gamified frequency; funnel to mobile order &amp; stored-value reload (float + breakage); status psychology via new tiers.</w:t>
+              <w:t>Drive daily frequency/habit; shift spend onto prepaid reload, whose float (~$1.85B held interest-free) and breakage (~$207M/yr recognised) partly self-fund the rewards; capture order-level data via the app (a coffee run is otherwise an anonymous card/cash transaction); push mobile-order efficiency.</w:t>
             </w:r>
           </w:p>
         </w:tc>
@@ -10733,7 +10783,7 @@
                 <w:sz w:val="18"/>
                 <w:szCs w:val="18"/>
               </w:rPr>
-              <w:t>Goal-gradient + habit formation (Stars toward the next reward drive daily frequency); 6-month expiry on Green Stars manufactures urgency via loss aversion; variable-reward gamification (challenges, Starbucks for Life); prepaid reload exploits mental accounting — the money is already “spent.”</w:t>
+              <w:t>Goal-gradient and habit (Stars toward the next reward); loss aversion via 6-month Green expiry; mental accounting (reloaded money already feels "spent", so redemption feels free); variable-reward gamification. Attachment is thin and rebate-sensitive — the 2026 caps sparked immediate backlash.</w:t>
             </w:r>
           </w:p>
         </w:tc>
@@ -10791,7 +10841,7 @@
                 <w:sz w:val="18"/>
                 <w:szCs w:val="18"/>
               </w:rPr>
-              <w:t>Habit value (a daily reason to open the app) + functional value (order &amp; pay). It also shows the failure mode: the 2026 caps/expiry broke the “protect earned value, govern change” tenet and triggered backlash.</w:t>
+              <w:t>Not emotion — habit, convenience (order &amp; pay) and self-funding economics (float + breakage) that offset the in-kind rebate. It only works because frequency is high enough for a small reward to compound into routine.</w:t>
             </w:r>
           </w:p>
         </w:tc>
@@ -10853,7 +10903,7 @@
                 <w:sz w:val="18"/>
                 <w:szCs w:val="18"/>
               </w:rPr>
-              <w:t>Prepaid reload creates float + breakage economics most brands ignore — BUT the 2026 caps/expiry sparked a devaluation backlash, a warning against changing rules on loyal members.</w:t>
+              <w:t>The float/breakage engine needs high frequency and prepaid behaviour — DailyObjects is medium-frequency, so it does not transfer. What transfers: the app as the data-capture and habit-trigger hub. Do not expect a rebate to create attachment.</w:t>
             </w:r>
           </w:p>
         </w:tc>
@@ -11137,7 +11187,7 @@
                 <w:sz w:val="18"/>
                 <w:szCs w:val="18"/>
               </w:rPr>
-              <w:t>Sunk-cost lock-in → higher frequency &amp; share of wallet; subscription revenue as its own P&amp;L; content flywheel to cut churn.</w:t>
+              <w:t>Lock in share of wallet through sunk cost; run the membership fee as its own subscription P&amp;L; use the content bundle to suppress churn. This is a paid convenience bundle, not product discounting — the fee funds the shipping.</w:t>
             </w:r>
           </w:p>
         </w:tc>
@@ -11255,7 +11305,7 @@
                 <w:sz w:val="18"/>
                 <w:szCs w:val="18"/>
               </w:rPr>
-              <w:t>Sunk-cost &amp; commitment — a paid fee makes members consolidate spend to “get their money’s worth”; loss aversion makes cancelling feel like losing a daily-used bundle; “free” shipping reframes the cost of every basket.</w:t>
+              <w:t>Sunk cost and loss aversion, and unusually strong because the fee is paid upfront: members buy more to "get their money’s worth", and cancelling means losing a bundle used almost daily.</w:t>
             </w:r>
           </w:p>
         </w:tc>
@@ -11313,7 +11363,7 @@
                 <w:sz w:val="18"/>
                 <w:szCs w:val="18"/>
               </w:rPr>
-              <w:t>Overwhelming functional value (convenience) with economic value visible at ~10× the fee; habit through frequency. Economics tenet in action: a self-funding subscription P&amp;L, not a points liability.</w:t>
+              <w:t>Perceived value dwarfs the fee (~10x) and the bundle is used often enough that cancellation feels like a loss. The economics are self-funding — a fee, not a margin give-back.</w:t>
             </w:r>
           </w:p>
         </w:tc>
@@ -11375,7 +11425,7 @@
                 <w:sz w:val="18"/>
                 <w:szCs w:val="18"/>
               </w:rPr>
-              <w:t>A paid membership works only when perceived value visibly exceeds the fee (~10x here) and bundles convenience + content so cancelling feels like a loss.</w:t>
+              <w:t>A paid tier only works when benefits are used often enough to justify the fee — hard at medium frequency. For DailyObjects it is a later, narrow play for the highest-frequency customers, never the opening move.</w:t>
             </w:r>
           </w:p>
         </w:tc>
@@ -11659,7 +11709,7 @@
                 <w:sz w:val="18"/>
                 <w:szCs w:val="18"/>
               </w:rPr>
-              <w:t>Drive direct booking (bypass OTAs); status-based emotional lock-in; ancillary card/partner revenue; experiential currency to defend rate.</w:t>
+              <w:t>The real economic win is driving DIRECT bookings — avoiding ~15–25% OTA commission, which more than funds the whole programme. Points→free nights are a rebate, but status perks (upgrades, lounge, breakfast) are near-zero marginal cost. Plus card/partner ancillary revenue and status-based lock-in.</w:t>
             </w:r>
           </w:p>
         </w:tc>
@@ -11777,7 +11827,7 @@
                 <w:sz w:val="18"/>
                 <w:szCs w:val="18"/>
               </w:rPr>
-              <w:t>Status-striving and the aspirational “chase”; loss aversion on annual elite re-qualification; experiential rewards satisfy esteem &amp; identity; “earning the right to indulge” — nights of effort justify a money-can’t-buy Moment.</w:t>
+              <w:t>Status-striving, loss aversion on annual re-qualification, and "earning the right to indulge" (nights of effort justify a money-can’t-buy Moment). Genuine because status is visible and comparative.</w:t>
             </w:r>
           </w:p>
         </w:tc>
@@ -11835,7 +11885,7 @@
                 <w:sz w:val="18"/>
                 <w:szCs w:val="18"/>
               </w:rPr>
-              <w:t>Status value and experiential value are the differentiators; recognition over discount protects room rate; partnerships extend utility. Emotional lock-in — not price — is the moat.</w:t>
+              <w:t>The rewards are cheap to give — funded by OTA-commission savings and perishable, low-marginal-cost inventory (an upgrade or empty room costs ~nothing) — while status creates emotional lock-in a cash discount cannot.</w:t>
             </w:r>
           </w:p>
         </w:tc>
@@ -11897,7 +11947,7 @@
                 <w:sz w:val="18"/>
                 <w:szCs w:val="18"/>
               </w:rPr>
-              <w:t>Status tiers create an aspirational “chase,” and experiential rewards let a premium brand reward loyalty without discounting the core product.</w:t>
+              <w:t>Cheap-to-give status (early access, recognition) beats cash rebates. But DailyObjects has no OTA-commission windfall to fund rewards and no perishable inventory — a free case is real COGS, unlike an upgraded room — so it must fund from margin/incrementality and lean even harder on zero-cost recognition and access.</w:t>
             </w:r>
           </w:p>
         </w:tc>
@@ -12181,7 +12231,7 @@
                 <w:sz w:val="18"/>
                 <w:szCs w:val="18"/>
               </w:rPr>
-              <w:t>Premium fee revenue + interchange; engineered monthly engagement to justify the fee; transferable points create switching cost; status signalling.</w:t>
+              <w:t>Fee + interchange revenue; engineer monthly engagement through use-it-or-lose-it credits as the retention mechanism; signal status; lock in via final point transfers. The credits are a curated rebate funded by the fee, not a product markdown.</w:t>
             </w:r>
           </w:p>
         </w:tc>
@@ -12299,7 +12349,7 @@
                 <w:sz w:val="18"/>
                 <w:szCs w:val="18"/>
               </w:rPr>
-              <w:t>Loss aversion engineered monthly (use-it-or-lose-it credits force engagement); sunk-cost on the $895 fee; status signalling (metal card, lounges) satisfies identity; final point-transfers create commitment and switching cost.</w:t>
+              <w:t>Sunk cost (the $895 fee), loss aversion (monthly credits expire if unused), status signalling (metal card, lounges). Powerful because the fee is prepaid and the credits force recurring engagement.</w:t>
             </w:r>
           </w:p>
         </w:tc>
@@ -12357,7 +12407,7 @@
                 <w:sz w:val="18"/>
                 <w:szCs w:val="18"/>
               </w:rPr>
-              <w:t>Status + utility value, plus “engagement as retention” — the tenet that a programme is a system used over time. Premium price becomes a feature; economics = fee + interchange, not markdowns.</w:t>
+              <w:t>Engagement is engineered as retention — the credit stack makes you return monthly — and it is funded by fee + interchange, not by eroding product margin.</w:t>
             </w:r>
           </w:p>
         </w:tc>
@@ -12419,7 +12469,7 @@
                 <w:sz w:val="18"/>
                 <w:szCs w:val="18"/>
               </w:rPr>
-              <w:t>Bundle many small use-it-or-lose-it credits so members engage monthly to rationalise a high fee — engagement itself becomes the retention mechanism.</w:t>
+              <w:t>Transferable idea: give members a reason to return on a cadence (early drops, a members’ day). Not transferable: the economics — a retailer has no interchange, and paywalled credits would just be discounting behind a fee.</w:t>
             </w:r>
           </w:p>
         </w:tc>
@@ -12703,7 +12753,7 @@
                 <w:sz w:val="18"/>
                 <w:szCs w:val="18"/>
               </w:rPr>
-              <w:t>First-party data + DTC margin; community/app engagement builds emotional relationship independent of purchase; scarcity drives desire &amp; installs.</w:t>
+              <w:t>Capture DTC margin and genuinely new first-party data (SNKRS/app registration ties the buyer to the sale); build emotional/community engagement independent of any purchase. No points, no discount.</w:t>
             </w:r>
           </w:p>
         </w:tc>
@@ -12821,7 +12871,7 @@
                 <w:sz w:val="18"/>
                 <w:szCs w:val="18"/>
               </w:rPr>
-              <w:t>Identity &amp; belonging (membership is self-expression); scarcity/FOMO on SNKRS drops drives desire; community (Run Club) builds intrinsic, non-transactional engagement; reciprocity from genuinely useful free apps.</w:t>
+              <w:t>Identity and belonging (membership as self-expression), scarcity/FOMO on drops, reciprocity from genuinely useful free apps. Emotion here is real because nothing is being rebated.</w:t>
             </w:r>
           </w:p>
         </w:tc>
@@ -12879,7 +12929,7 @@
                 <w:sz w:val="18"/>
                 <w:szCs w:val="18"/>
               </w:rPr>
-              <w:t>Emotional, experiential and community value — the defensible layers — with zero discounting; access as a margin-safe reward; DTC data as the ROI. The clearest “recognition over discount” model for a design-led brand.</w:t>
+              <w:t>It rewards with access, content and community — near-zero marginal cost and impossible to price-match — rather than money off. This is the cleanest recognition-over-discount model.</w:t>
             </w:r>
           </w:p>
         </w:tc>
@@ -12941,7 +12991,7 @@
                 <w:sz w:val="18"/>
                 <w:szCs w:val="18"/>
               </w:rPr>
-              <w:t>A free membership can drive loyalty entirely through access + content + community — and early access to drops is a powerful, margin-safe reward for a design-led brand.</w:t>
+              <w:t>The most transferable model: reward with early access to drops, content and community, not discounts. Caveat — it works because Nike is aspirational enough that access IS a reward; DailyObjects is mid-premium, so it must first build genuine drop/scarcity desirability for access to bite.</w:t>
             </w:r>
           </w:p>
         </w:tc>
@@ -13225,7 +13275,7 @@
                 <w:sz w:val="18"/>
                 <w:szCs w:val="18"/>
               </w:rPr>
-              <w:t>Capture first-party data; deepen community (“sweat” + events); drive app engagement and repeat — without discounting core product.</w:t>
+              <w:t>First-party data, community depth and app engagement that drive repeat purchase without discounting the core product.</w:t>
             </w:r>
           </w:p>
         </w:tc>
@@ -13343,7 +13393,7 @@
                 <w:sz w:val="18"/>
                 <w:szCs w:val="18"/>
               </w:rPr>
-              <w:t>Belonging &amp; identity through community and “sweat”; reciprocity from generous service (free hemming, easy returns) creates felt obligation; member-only access carries an endowment effect.</w:t>
+              <w:t>Belonging and identity through community and events; reciprocity from unusually generous service (free hemming, easy returns) creates felt obligation. Little of it is transactional.</w:t>
             </w:r>
           </w:p>
         </w:tc>
@@ -13401,7 +13451,7 @@
                 <w:sz w:val="18"/>
                 <w:szCs w:val="18"/>
               </w:rPr>
-              <w:t>Utility (service) + community value carry the entire programme; emotional connection without any markdown; mechanics matched to a premium aesthetic. The closest philosophical analog for DailyObjects.</w:t>
+              <w:t>Service perks are cheap to provide yet high in perceived value, and community builds identity — loyalty with no markdown and no points ledger.</w:t>
             </w:r>
           </w:p>
         </w:tc>
@@ -13463,7 +13513,7 @@
                 <w:sz w:val="18"/>
                 <w:szCs w:val="18"/>
               </w:rPr>
-              <w:t>Service benefits (free hemming, easy/extended returns) + community events can BE the whole value proposition for a premium brand — the closest philosophical analog for design-led accessories.</w:t>
+              <w:t>The closest analog. Service (warranty, easy returns, free personalisation) plus community can carry loyalty on their own — cheap and on-brand. Caveat: ROI is hard to see (Lululemon discloses none), so DailyObjects must instrument it against a holdout.</w:t>
             </w:r>
           </w:p>
         </w:tc>
@@ -13747,7 +13797,7 @@
                 <w:sz w:val="18"/>
                 <w:szCs w:val="18"/>
               </w:rPr>
-              <w:t>Drive app adoption + store visits; gather data; nudge frequency with modest coupons without loud gamification.</w:t>
+              <w:t>App adoption, store footfall (via check-in, not just spend) and a modest frequency nudge, with light data capture. The coupons themselves are a small discount; the distinctive design is the restraint and the non-spend earn.</w:t>
             </w:r>
           </w:p>
         </w:tc>
@@ -13865,7 +13915,7 @@
                 <w:sz w:val="18"/>
                 <w:szCs w:val="18"/>
               </w:rPr>
-              <w:t>Low-friction habit via store check-in (endowed progress toward coupon thresholds); deliberate restraint avoids over-gamification fatigue; modest coupons trigger reciprocity without cheapening the brand.</w:t>
+              <w:t>Endowed progress toward coupon thresholds and low-friction habit via store check-in; deliberate restraint avoids the fatigue of over-gamification.</w:t>
             </w:r>
           </w:p>
         </w:tc>
@@ -13923,7 +13973,7 @@
                 <w:sz w:val="18"/>
                 <w:szCs w:val="18"/>
               </w:rPr>
-              <w:t>Habit + utility value delivered quietly — the “match mechanics to brand aesthetic” tenet is the whole point; simple, unobtrusive; data-driven personalisation reportedly doubled redemption.</w:t>
+              <w:t>The mechanics match a minimalist brand, and store check-in decouples engagement (and footfall) from spend. The coupons are the least important part.</w:t>
             </w:r>
           </w:p>
         </w:tc>
@@ -13985,7 +14035,7 @@
                 <w:sz w:val="18"/>
                 <w:szCs w:val="18"/>
               </w:rPr>
-              <w:t>Match loyalty mechanics to brand aesthetic — a minimalist brand runs a quiet programme; the store check-in earn is a clever footfall driver decoupled from spend.</w:t>
+              <w:t>Borrow the engagement/footfall earning (reward non-spend actions and store visits) and the discipline of matching loudness to brand — not the coupons, which are simply discounting.</w:t>
             </w:r>
           </w:p>
         </w:tc>
@@ -14269,7 +14319,7 @@
                 <w:sz w:val="18"/>
                 <w:szCs w:val="18"/>
               </w:rPr>
-              <w:t>Protect brand equity &amp; price integrity; use gifting, sampling and service to build emotional loyalty and reduce trial risk.</w:t>
+              <w:t>Protect price integrity, de-risk trial of a high-ticket product through sampling, and build emotional loyalty — explicitly without any discount.</w:t>
             </w:r>
           </w:p>
         </w:tc>
@@ -14387,7 +14437,7 @@
                 <w:sz w:val="18"/>
                 <w:szCs w:val="18"/>
               </w:rPr>
-              <w:t>Reciprocity — a birthday gift and a free sample read as generosity, not a transaction; sampling reduces the perceived risk (and buyer’s remorse) of a high-ticket scent; exclusivity satisfies status without any price cue.</w:t>
+              <w:t>Reciprocity (a birthday gift and a free sample read as generosity, not a transaction), risk-reduction (sampling lowers buyer’s remorse on an expensive scent), and exclusivity/status — all with zero price cue.</w:t>
             </w:r>
           </w:p>
         </w:tc>
@@ -14445,7 +14495,7 @@
                 <w:sz w:val="18"/>
                 <w:szCs w:val="18"/>
               </w:rPr>
-              <w:t>Emotional value through gifting, sampling and service; the strongest “loyalty without discounting” case; it protects price integrity — the premium-brand tenet. Directly transferable to DailyObjects.</w:t>
+              <w:t>Gifting, sampling and service build attachment while protecting price — the purest "loyalty without discounting" case in the set.</w:t>
             </w:r>
           </w:p>
         </w:tc>
@@ -14507,7 +14557,7 @@
                 <w:sz w:val="18"/>
                 <w:szCs w:val="18"/>
               </w:rPr>
-              <w:t>For a premium/design-led brand, loyalty = gifting, sampling, service and access — never markdowns. The most directly transferable luxury model.</w:t>
+              <w:t>Most transferable for a premium brand: gifts, samples (e.g. a small accessory with a bag), service and early access instead of markdowns. Caveat: unlike Marriott’s upgrades, a physical sample is real COGS — scope it to margin.</w:t>
             </w:r>
           </w:p>
         </w:tc>
@@ -14791,7 +14841,7 @@
                 <w:sz w:val="18"/>
                 <w:szCs w:val="18"/>
               </w:rPr>
-              <w:t>Sustain habit in high-frequency categories; capture first-party data; drive app adoption; tie loyalty to values (recycling).</w:t>
+              <w:t>Sustain frequency in a high-frequency / lower-margin category; capture data; drive app adoption. Be clear-eyed: both cores — H&amp;M’s vouchers and Ulta’s $-off — are points-for-money-off, i.e. structured discounting.</w:t>
             </w:r>
           </w:p>
         </w:tc>
@@ -14909,7 +14959,7 @@
                 <w:sz w:val="18"/>
                 <w:szCs w:val="18"/>
               </w:rPr>
-              <w:t>H&amp;M — frequent low-threshold vouchers exploit goal-gradient (small, reachable wins) and non-purchase earn taps reciprocity; recycling-for-coupon ties identity to values. Ulta — a non-linear redemption curve rewards accumulation (endowment + sunk cost), nudging members to bank points and concentrate spend.</w:t>
+              <w:t>Goal-gradient via small, reachable wins (H&amp;M’s frequent low-threshold vouchers); endowment and sunk cost via accumulation (Ulta’s non-linear curve, worth more when banked); reciprocity from non-purchase earn (reviews, profile).</w:t>
             </w:r>
           </w:p>
         </w:tc>
@@ -14967,7 +15017,7 @@
                 <w:sz w:val="18"/>
                 <w:szCs w:val="18"/>
               </w:rPr>
-              <w:t>Economic value engineered around the redemption curve; habit through frequent wins; engagement earning (reviews, profile) deepens data cheaply. Ulta shows “reward the accumulator” to raise switching cost.</w:t>
+              <w:t>Frequency is high enough that small rebates sustain habit, and Ulta’s curve rewards banking points (raising switching cost). Honest verdict: engineered discounting plus data — not emotional attachment.</w:t>
             </w:r>
           </w:p>
         </w:tc>
@@ -15029,7 +15079,7 @@
                 <w:sz w:val="18"/>
                 <w:szCs w:val="18"/>
               </w:rPr>
-              <w:t>Frequent low-threshold vouchers sustain habit; non-purchase earn (reviews/profile/referral/recycling) deepens engagement cheaply; a non-linear redemption curve rewards accumulation → switching cost.</w:t>
+              <w:t>The models to copy LEAST wholesale — essentially structured discounting suited to high-frequency, lower-margin retail; at DailyObjects’ mid-premium, medium-frequency profile they would erode margin and train discount-seeking. Do borrow the non-purchase earn (reviews for data/content) and, if using points, a non-linear redemption curve.</w:t>
             </w:r>
           </w:p>
         </w:tc>

</xml_diff>

<commit_message>
Apply honest discounting lens to Indian programmes & comparables
- Add 'Honest read & lesson for DailyObjects' column to both Section 6
  tables, classifying each programme's true mechanic (deferred rebate /
  near-pure discounting / paid convenience / genuinely non-discount) and
  correcting the DailyObjects takeaway for all 20 brands
- Add a Section 6 framing note naming the two dominant Indian archetypes
  (coalition/e-com point rebates; paid-convenience memberships) and the
  minority of genuinely non-discount ideas worth borrowing, with the
  physical-product COGS caveat

Co-Authored-By: Claude Opus 4.8 <noreply@anthropic.com>
Claude-Session: https://claude.ai/code/session_01H42f9onhzyUUMa7YSHdZFA
</commit_message>
<xml_diff>
--- a/DailyObjects_Loyalty_Strategy.docx
+++ b/DailyObjects_Loyalty_Strategy.docx
@@ -15117,6 +15117,47 @@
     </w:p>
     <w:p>
       <w:pPr>
+        <w:spacing w:after="160"/>
+      </w:pPr>
+      <w:r>
+        <w:rPr>
+          <w:rFonts w:ascii="Calibri" w:hAnsi="Calibri"/>
+          <w:b/>
+          <w:color w:val="2B2B2B"/>
+          <w:sz w:val="21"/>
+        </w:rPr>
+        <w:t xml:space="preserve">Reading Section 6 with the same lens. </w:t>
+      </w:r>
+      <w:r>
+        <w:rPr>
+          <w:rFonts w:ascii="Calibri" w:hAnsi="Calibri"/>
+          <w:b w:val="0"/>
+          <w:color w:val="2B2B2B"/>
+          <w:sz w:val="21"/>
+        </w:rPr>
+        <w:t xml:space="preserve">Indian loyalty is dominated by two archetypes that are mostly discounting in disguise: coalition and e-commerce point currencies (Tata Neu, Reliance, Flipkart, Nykaa, Decathlon), where earning ~0.5–2% back to redeem later is a deferred rebate; and paid-convenience memberships (Swiggy, Bewakoof), where a fee funds free delivery. </w:t>
+      </w:r>
+      <w:r>
+        <w:rPr>
+          <w:rFonts w:ascii="Calibri" w:hAnsi="Calibri"/>
+          <w:b w:val="0"/>
+          <w:color w:val="2B2B2B"/>
+          <w:sz w:val="21"/>
+        </w:rPr>
+        <w:t xml:space="preserve">The genuinely non-discount, defensible ideas are the minority — and those are the ones worth borrowing: Tira (points buy product, not cash), Shoppers Stop Black (an experiential top tier), Titan (milestone anchoring plus a savings/commitment device), Croma (warranty, service and trade-in as currency), and Myntra/Decathlon (engagement earning that builds data and content). </w:t>
+      </w:r>
+      <w:r>
+        <w:rPr>
+          <w:rFonts w:ascii="Calibri" w:hAnsi="Calibri"/>
+          <w:b w:val="0"/>
+          <w:color w:val="2B2B2B"/>
+          <w:sz w:val="21"/>
+        </w:rPr>
+        <w:t>The COGS caveat still applies: unlike a coalition giant funding rewards from partner budgets, DailyObjects funds every reward from its own product margin — so it should cherry-pick the non-discount mechanics and avoid the coalition/discount race. The “honest read” column below classifies each programme and corrects its lesson.</w:t>
+      </w:r>
+    </w:p>
+    <w:p>
+      <w:pPr>
         <w:pStyle w:val="3"/>
         <w:spacing w:before="240" w:after="90"/>
       </w:pPr>
@@ -15279,7 +15320,7 @@
                 <w:sz w:val="18"/>
                 <w:szCs w:val="18"/>
               </w:rPr>
-              <w:t>Transferable lesson</w:t>
+              <w:t>Honest read &amp; lesson for DailyObjects</w:t>
             </w:r>
           </w:p>
         </w:tc>
@@ -15384,12 +15425,21 @@
             </w:pPr>
             <w:r>
               <w:rPr>
-                <w:rFonts w:ascii="Calibri" w:hAnsi="Calibri" w:eastAsia="Calibri" w:cs="Calibri"/>
-                <w:color w:val="2B2B2B"/>
-                <w:sz w:val="18"/>
-                <w:szCs w:val="18"/>
-              </w:rPr>
-              <w:t>Rolling activity-based expiry — every earn/redeem resets the 365-day clock, so lapse is rare</w:t>
+                <w:rFonts w:ascii="Calibri" w:hAnsi="Calibri"/>
+                <w:b/>
+                <w:color w:val="B45F3B"/>
+                <w:sz w:val="18"/>
+              </w:rPr>
+              <w:t xml:space="preserve">Discount at core — </w:t>
+            </w:r>
+            <w:r>
+              <w:rPr>
+                <w:rFonts w:ascii="Calibri" w:hAnsi="Calibri"/>
+                <w:b w:val="0"/>
+                <w:color w:val="2B2B2B"/>
+                <w:sz w:val="18"/>
+              </w:rPr>
+              <w:t>NeuCoins are a ~2–8% rebate dressed as a currency; the non-discount edge is coalition breadth + rolling activity-based expiry, yet engagement stayed weak. DO: borrow only the rolling expiry — a currency alone doesn’t create loyalty, and you can’t out-scale a conglomerate.</w:t>
             </w:r>
           </w:p>
         </w:tc>
@@ -15498,12 +15548,21 @@
             </w:pPr>
             <w:r>
               <w:rPr>
-                <w:rFonts w:ascii="Calibri" w:hAnsi="Calibri" w:eastAsia="Calibri" w:cs="Calibri"/>
-                <w:color w:val="2B2B2B"/>
-                <w:sz w:val="18"/>
-                <w:szCs w:val="18"/>
-              </w:rPr>
-              <w:t>Coalition breadth; don’t fight it on scale — win on depth &amp; design</w:t>
+                <w:rFonts w:ascii="Calibri" w:hAnsi="Calibri"/>
+                <w:b/>
+                <w:color w:val="B45F3B"/>
+                <w:sz w:val="18"/>
+              </w:rPr>
+              <w:t xml:space="preserve">Near-pure discounting — </w:t>
+            </w:r>
+            <w:r>
+              <w:rPr>
+                <w:rFonts w:ascii="Calibri" w:hAnsi="Calibri"/>
+                <w:b w:val="0"/>
+                <w:color w:val="2B2B2B"/>
+                <w:sz w:val="18"/>
+              </w:rPr>
+              <w:t>a thin ~0.5% rebate across a retail empire; breadth is the only differentiator and emotional pull is low. DO: nothing to copy on mechanics — compete on depth, design and identity, not breadth.</w:t>
             </w:r>
           </w:p>
         </w:tc>
@@ -15608,12 +15667,21 @@
             </w:pPr>
             <w:r>
               <w:rPr>
-                <w:rFonts w:ascii="Calibri" w:hAnsi="Calibri" w:eastAsia="Calibri" w:cs="Calibri"/>
-                <w:color w:val="2B2B2B"/>
-                <w:sz w:val="18"/>
-                <w:szCs w:val="18"/>
-              </w:rPr>
-              <w:t>Reward engagement not just spend; a fixed recurring “members’ day” builds habit</w:t>
+                <w:rFonts w:ascii="Calibri" w:hAnsi="Calibri"/>
+                <w:b/>
+                <w:color w:val="B45F3B"/>
+                <w:sz w:val="18"/>
+              </w:rPr>
+              <w:t xml:space="preserve">Discount, but smartly wrapped — </w:t>
+            </w:r>
+            <w:r>
+              <w:rPr>
+                <w:rFonts w:ascii="Calibri" w:hAnsi="Calibri"/>
+                <w:b w:val="0"/>
+                <w:color w:val="2B2B2B"/>
+                <w:sz w:val="18"/>
+              </w:rPr>
+              <w:t>the coins are a rebate and the headline is a monthly % off, but engagement earning (reviews, quizzes) builds data/content and Insider Day builds habit. DO: copy the engagement earning and a recurring members’ moment — not the monthly discount, which trains deal-waiting.</w:t>
             </w:r>
           </w:p>
         </w:tc>
@@ -15722,12 +15790,21 @@
             </w:pPr>
             <w:r>
               <w:rPr>
-                <w:rFonts w:ascii="Calibri" w:hAnsi="Calibri" w:eastAsia="Calibri" w:cs="Calibri"/>
-                <w:color w:val="2B2B2B"/>
-                <w:sz w:val="18"/>
-                <w:szCs w:val="18"/>
-              </w:rPr>
-              <w:t>Calendar/birthday moments are cheap, high-affinity — ideal for a gifting category</w:t>
+                <w:rFonts w:ascii="Calibri" w:hAnsi="Calibri"/>
+                <w:b/>
+                <w:color w:val="B45F3B"/>
+                <w:sz w:val="18"/>
+              </w:rPr>
+              <w:t xml:space="preserve">Discount with an emotional frame — </w:t>
+            </w:r>
+            <w:r>
+              <w:rPr>
+                <w:rFonts w:ascii="Calibri" w:hAnsi="Calibri"/>
+                <w:b w:val="0"/>
+                <w:color w:val="2B2B2B"/>
+                <w:sz w:val="18"/>
+              </w:rPr>
+              <w:t>points and birthday multipliers are still rebates, just time-boxed; the “your month” framing is the only non-discount part. DO: keep the low-cost birthday moment, but deliver it as a gift or early access, not another % off.</w:t>
             </w:r>
           </w:p>
         </w:tc>
@@ -15832,12 +15909,21 @@
             </w:pPr>
             <w:r>
               <w:rPr>
-                <w:rFonts w:ascii="Calibri" w:hAnsi="Calibri" w:eastAsia="Calibri" w:cs="Calibri"/>
-                <w:color w:val="2B2B2B"/>
-                <w:sz w:val="18"/>
-                <w:szCs w:val="18"/>
-              </w:rPr>
-              <w:t>Let points buy aspirational product, not just rupees off</w:t>
+                <w:rFonts w:ascii="Calibri" w:hAnsi="Calibri"/>
+                <w:b/>
+                <w:color w:val="B45F3B"/>
+                <w:sz w:val="18"/>
+              </w:rPr>
+              <w:t xml:space="preserve">De-discounted redemption — </w:t>
+            </w:r>
+            <w:r>
+              <w:rPr>
+                <w:rFonts w:ascii="Calibri" w:hAnsi="Calibri"/>
+                <w:b w:val="0"/>
+                <w:color w:val="2B2B2B"/>
+                <w:sz w:val="18"/>
+              </w:rPr>
+              <w:t>the smartest burn design in the set: points buy aspirational PRODUCT, not cash, which feels like a gift and steers value away from cash-back. DO: directly transferable — let points buy product/limited editions to protect price perception.</w:t>
             </w:r>
           </w:p>
         </w:tc>
@@ -15946,12 +16032,21 @@
             </w:pPr>
             <w:r>
               <w:rPr>
-                <w:rFonts w:ascii="Calibri" w:hAnsi="Calibri" w:eastAsia="Calibri" w:cs="Calibri"/>
-                <w:color w:val="2B2B2B"/>
-                <w:sz w:val="18"/>
-                <w:szCs w:val="18"/>
-              </w:rPr>
-              <w:t>Experiential/service perks at the top tier sell belonging, not discounts</w:t>
+                <w:rFonts w:ascii="Calibri" w:hAnsi="Calibri"/>
+                <w:b/>
+                <w:color w:val="B45F3B"/>
+                <w:sz w:val="18"/>
+              </w:rPr>
+              <w:t xml:space="preserve">Genuinely non-discount at the top — </w:t>
+            </w:r>
+            <w:r>
+              <w:rPr>
+                <w:rFonts w:ascii="Calibri" w:hAnsi="Calibri"/>
+                <w:b w:val="0"/>
+                <w:color w:val="2B2B2B"/>
+                <w:sz w:val="18"/>
+              </w:rPr>
+              <w:t>base points are a rebate, but the paid Black tier sells belonging through experiences and service. DO: emulate the aspirational, experiential top tier — but a physical-goods brand funds experiences from margin, so scope them.</w:t>
             </w:r>
           </w:p>
         </w:tc>
@@ -16056,12 +16151,21 @@
             </w:pPr>
             <w:r>
               <w:rPr>
-                <w:rFonts w:ascii="Calibri" w:hAnsi="Calibri" w:eastAsia="Calibri" w:cs="Calibri"/>
-                <w:color w:val="2B2B2B"/>
-                <w:sz w:val="18"/>
-                <w:szCs w:val="18"/>
-              </w:rPr>
-              <w:t>Loyalty + a commitment/savings mechanic + milestone anchoring lengthens lifetime</w:t>
+                <w:rFonts w:ascii="Calibri" w:hAnsi="Calibri"/>
+                <w:b/>
+                <w:color w:val="B45F3B"/>
+                <w:sz w:val="18"/>
+              </w:rPr>
+              <w:t xml:space="preserve">Commitment beats points — </w:t>
+            </w:r>
+            <w:r>
+              <w:rPr>
+                <w:rFonts w:ascii="Calibri" w:hAnsi="Calibri"/>
+                <w:b w:val="0"/>
+                <w:color w:val="2B2B2B"/>
+                <w:sz w:val="18"/>
+              </w:rPr>
+              <w:t>points are a rebate; the real levers are non-discount — life-event anchoring and the Golden Harvest savings scheme that locks future spend. DO: borrow milestone anchoring and a possible pre-pay/commitment mechanic for higher-ticket items.</w:t>
             </w:r>
           </w:p>
         </w:tc>
@@ -16170,12 +16274,21 @@
             </w:pPr>
             <w:r>
               <w:rPr>
-                <w:rFonts w:ascii="Calibri" w:hAnsi="Calibri" w:eastAsia="Calibri" w:cs="Calibri"/>
-                <w:color w:val="2B2B2B"/>
-                <w:sz w:val="18"/>
-                <w:szCs w:val="18"/>
-              </w:rPr>
-              <w:t>A paid membership works when the ROI maths is self-evident (free shipping)</w:t>
+                <w:rFonts w:ascii="Calibri" w:hAnsi="Calibri"/>
+                <w:b/>
+                <w:color w:val="B45F3B"/>
+                <w:sz w:val="18"/>
+              </w:rPr>
+              <w:t xml:space="preserve">Paid convenience, not product discount — </w:t>
+            </w:r>
+            <w:r>
+              <w:rPr>
+                <w:rFonts w:ascii="Calibri" w:hAnsi="Calibri"/>
+                <w:b w:val="0"/>
+                <w:color w:val="2B2B2B"/>
+                <w:sz w:val="18"/>
+              </w:rPr>
+              <w:t>a fee funds free delivery; ROI is obvious only at high frequency, and BLCK adds status. DO: a paid tier needs obvious maths and frequent use — hard for DailyObjects, where shipping is a smaller share of the basket; keep it a later, narrow play.</w:t>
             </w:r>
           </w:p>
         </w:tc>
@@ -16280,12 +16393,21 @@
             </w:pPr>
             <w:r>
               <w:rPr>
-                <w:rFonts w:ascii="Calibri" w:hAnsi="Calibri" w:eastAsia="Calibri" w:cs="Calibri"/>
-                <w:color w:val="2B2B2B"/>
-                <w:sz w:val="18"/>
-                <w:szCs w:val="18"/>
-              </w:rPr>
-              <w:t>Transparent flat economics + pay for reviews to fuel the content flywheel</w:t>
+                <w:rFonts w:ascii="Calibri" w:hAnsi="Calibri"/>
+                <w:b/>
+                <w:color w:val="B45F3B"/>
+                <w:sz w:val="18"/>
+              </w:rPr>
+              <w:t xml:space="preserve">Transparent discounting + data — </w:t>
+            </w:r>
+            <w:r>
+              <w:rPr>
+                <w:rFonts w:ascii="Calibri" w:hAnsi="Calibri"/>
+                <w:b w:val="0"/>
+                <w:color w:val="2B2B2B"/>
+                <w:sz w:val="18"/>
+              </w:rPr>
+              <w:t>an explicit ~2% rebate; the clever non-discount bit is paying for reviews. DO: copy the review-for-points mechanic (cheap data and content), not the flat rebate.</w:t>
             </w:r>
           </w:p>
         </w:tc>
@@ -16394,12 +16516,21 @@
             </w:pPr>
             <w:r>
               <w:rPr>
-                <w:rFonts w:ascii="Calibri" w:hAnsi="Calibri" w:eastAsia="Calibri" w:cs="Calibri"/>
-                <w:color w:val="2B2B2B"/>
-                <w:sz w:val="18"/>
-                <w:szCs w:val="18"/>
-              </w:rPr>
-              <w:t>In durable tech, warranty/repair/trade-in ARE loyalty currency</w:t>
+                <w:rFonts w:ascii="Calibri" w:hAnsi="Calibri"/>
+                <w:b/>
+                <w:color w:val="B45F3B"/>
+                <w:sz w:val="18"/>
+              </w:rPr>
+              <w:t xml:space="preserve">Service is the real currency — </w:t>
+            </w:r>
+            <w:r>
+              <w:rPr>
+                <w:rFonts w:ascii="Calibri" w:hAnsi="Calibri"/>
+                <w:b w:val="0"/>
+                <w:color w:val="2B2B2B"/>
+                <w:sz w:val="18"/>
+              </w:rPr>
+              <w:t>points are a rebate, but warranty, e-waste pickup, exchange and lifetime service are the non-discount value that fits durable tech. DO: directly relevant — warranty/repair/trade-in as loyalty currency, carrying the sustainability story.</w:t>
             </w:r>
           </w:p>
         </w:tc>
@@ -16574,7 +16705,7 @@
                 <w:sz w:val="18"/>
                 <w:szCs w:val="18"/>
               </w:rPr>
-              <w:t>What it does / lesson</w:t>
+              <w:t>Honest read &amp; lesson for DailyObjects</w:t>
             </w:r>
           </w:p>
         </w:tc>
@@ -16681,12 +16812,21 @@
             </w:pPr>
             <w:r>
               <w:rPr>
-                <w:rFonts w:ascii="Calibri" w:hAnsi="Calibri" w:eastAsia="Calibri" w:cs="Calibri"/>
-                <w:color w:val="2B2B2B"/>
-                <w:sz w:val="18"/>
-                <w:szCs w:val="18"/>
-              </w:rPr>
-              <w:t>Casetify Club: $1=1pt, tiers on trailing-12-mo spend, birthday gift + 30% vouchers, 12-mo VIP warranty — the direct in-category template</w:t>
+                <w:rFonts w:ascii="Calibri" w:hAnsi="Calibri"/>
+                <w:b/>
+                <w:color w:val="B45F3B"/>
+                <w:sz w:val="18"/>
+              </w:rPr>
+              <w:t xml:space="preserve">In-category, but voucher-led — </w:t>
+            </w:r>
+            <w:r>
+              <w:rPr>
+                <w:rFonts w:ascii="Calibri" w:hAnsi="Calibri"/>
+                <w:b w:val="0"/>
+                <w:color w:val="2B2B2B"/>
+                <w:sz w:val="18"/>
+              </w:rPr>
+              <w:t>the 30% vouchers are discounting; the tier + birthday gift + 12-mo VIP warranty are the non-discount, on-brand layer. DO: the template to follow — but lead with warranty/tier/birthday and de-emphasise the vouchers.</w:t>
             </w:r>
           </w:p>
         </w:tc>
@@ -16797,12 +16937,21 @@
             </w:pPr>
             <w:r>
               <w:rPr>
-                <w:rFonts w:ascii="Calibri" w:hAnsi="Calibri" w:eastAsia="Calibri" w:cs="Calibri"/>
-                <w:color w:val="2B2B2B"/>
-                <w:sz w:val="18"/>
-                <w:szCs w:val="18"/>
-              </w:rPr>
-              <w:t>5% off even in sales, 6-yr warranty, early access; 3x sales from members; unlocked loyalty by broadening the catalogue to create purchase occasions</w:t>
+                <w:rFonts w:ascii="Calibri" w:hAnsi="Calibri"/>
+                <w:b/>
+                <w:color w:val="B45F3B"/>
+                <w:sz w:val="18"/>
+              </w:rPr>
+              <w:t xml:space="preserve">Member discount, cushioned — </w:t>
+            </w:r>
+            <w:r>
+              <w:rPr>
+                <w:rFonts w:ascii="Calibri" w:hAnsi="Calibri"/>
+                <w:b w:val="0"/>
+                <w:color w:val="2B2B2B"/>
+                <w:sz w:val="18"/>
+              </w:rPr>
+              <w:t>the 5%-off-even-in-sales core IS a guaranteed rebate, but the fee + 6-yr warranty + early access add lock-in, and it worked (3x member sales) once the catalogue broadened to create occasions. DO: frequency is the precondition for loyalty economics (your broad range is an asset); if you offer a member discount, pair it with warranty + access and test the margin.</w:t>
             </w:r>
           </w:p>
         </w:tc>
@@ -16907,12 +17056,21 @@
             </w:pPr>
             <w:r>
               <w:rPr>
-                <w:rFonts w:ascii="Calibri" w:hAnsi="Calibri" w:eastAsia="Calibri" w:cs="Calibri"/>
-                <w:color w:val="2B2B2B"/>
-                <w:sz w:val="18"/>
-                <w:szCs w:val="18"/>
-              </w:rPr>
-              <w:t>₹99/3mo–₹129/yr; free shipping, 24-hr early access; “pays for itself in 2–3 orders”</w:t>
+                <w:rFonts w:ascii="Calibri" w:hAnsi="Calibri"/>
+                <w:b/>
+                <w:color w:val="B45F3B"/>
+                <w:sz w:val="18"/>
+              </w:rPr>
+              <w:t xml:space="preserve">Paid convenience — </w:t>
+            </w:r>
+            <w:r>
+              <w:rPr>
+                <w:rFonts w:ascii="Calibri" w:hAnsi="Calibri"/>
+                <w:b w:val="0"/>
+                <w:color w:val="2B2B2B"/>
+                <w:sz w:val="18"/>
+              </w:rPr>
+              <w:t>free shipping funded by a fee, not product discounting; ROI obvious at low ticket + high frequency. DO: proven in Indian D2C, but shipping is a smaller share of an accessory basket — the ROI story is weaker; validate first.</w:t>
             </w:r>
           </w:p>
         </w:tc>
@@ -17021,12 +17179,21 @@
             </w:pPr>
             <w:r>
               <w:rPr>
-                <w:rFonts w:ascii="Calibri" w:hAnsi="Calibri" w:eastAsia="Calibri" w:cs="Calibri"/>
-                <w:color w:val="2B2B2B"/>
-                <w:sz w:val="18"/>
-                <w:szCs w:val="18"/>
-              </w:rPr>
-              <w:t>AnkerCredits ($1=1cr → 12/20/25% coupon ladder) + Anker Plus $15/yr (next-day delivery, extended warranty)</w:t>
+                <w:rFonts w:ascii="Calibri" w:hAnsi="Calibri"/>
+                <w:b/>
+                <w:color w:val="B45F3B"/>
+                <w:sz w:val="18"/>
+              </w:rPr>
+              <w:t xml:space="preserve">Discount-centric + service — </w:t>
+            </w:r>
+            <w:r>
+              <w:rPr>
+                <w:rFonts w:ascii="Calibri" w:hAnsi="Calibri"/>
+                <w:b w:val="0"/>
+                <w:color w:val="2B2B2B"/>
+                <w:sz w:val="18"/>
+              </w:rPr>
+              <w:t>the credit→coupon ladder is explicit discounting; Anker Plus adds paid convenience + warranty. DO: skip the coupon ladder — the transferable bit is a modest paid tier bundling warranty + delivery.</w:t>
             </w:r>
           </w:p>
         </w:tc>
@@ -17131,12 +17298,21 @@
             </w:pPr>
             <w:r>
               <w:rPr>
-                <w:rFonts w:ascii="Calibri" w:hAnsi="Calibri" w:eastAsia="Calibri" w:cs="Calibri"/>
-                <w:color w:val="2B2B2B"/>
-                <w:sz w:val="18"/>
-                <w:szCs w:val="18"/>
-              </w:rPr>
-              <w:t>TSS Coins return up to 20% of cart as credits — high-visibility repeat driver</w:t>
+                <w:rFonts w:ascii="Calibri" w:hAnsi="Calibri"/>
+                <w:b/>
+                <w:color w:val="B45F3B"/>
+                <w:sz w:val="18"/>
+              </w:rPr>
+              <w:t xml:space="preserve">High-visibility discounting — </w:t>
+            </w:r>
+            <w:r>
+              <w:rPr>
+                <w:rFonts w:ascii="Calibri" w:hAnsi="Calibri"/>
+                <w:b w:val="0"/>
+                <w:color w:val="2B2B2B"/>
+                <w:sz w:val="18"/>
+              </w:rPr>
+              <w:t>“20% back in coins” drives repeat on low-price merch but is a pure, margin-heavy rebate. DO: avoid — a 20%-back headline would train deal-seeking and erode a mid-premium position.</w:t>
             </w:r>
           </w:p>
         </w:tc>
@@ -17245,12 +17421,21 @@
             </w:pPr>
             <w:r>
               <w:rPr>
-                <w:rFonts w:ascii="Calibri" w:hAnsi="Calibri" w:eastAsia="Calibri" w:cs="Calibri"/>
-                <w:color w:val="2B2B2B"/>
-                <w:sz w:val="18"/>
-                <w:szCs w:val="18"/>
-              </w:rPr>
-              <w:t>Every engagement action earns credits; ₹100 first-purchase cashback</w:t>
+                <w:rFonts w:ascii="Calibri" w:hAnsi="Calibri"/>
+                <w:b/>
+                <w:color w:val="B45F3B"/>
+                <w:sz w:val="18"/>
+              </w:rPr>
+              <w:t xml:space="preserve">Rebate + cheap engagement — </w:t>
+            </w:r>
+            <w:r>
+              <w:rPr>
+                <w:rFonts w:ascii="Calibri" w:hAnsi="Calibri"/>
+                <w:b w:val="0"/>
+                <w:color w:val="2B2B2B"/>
+                <w:sz w:val="18"/>
+              </w:rPr>
+              <w:t>credits/cashback are discounting, but all-actions-earn captures data and engagement cheaply. DO: borrow the engagement breadth; drop the first-purchase cashback.</w:t>
             </w:r>
           </w:p>
         </w:tc>
@@ -17355,12 +17540,21 @@
             </w:pPr>
             <w:r>
               <w:rPr>
-                <w:rFonts w:ascii="Calibri" w:hAnsi="Calibri" w:eastAsia="Calibri" w:cs="Calibri"/>
-                <w:color w:val="2B2B2B"/>
-                <w:sz w:val="18"/>
-                <w:szCs w:val="18"/>
-              </w:rPr>
-              <w:t>Silver/Gold/Platinum 1–4 pts/₹100 — but store-only redemption limits a D2C world</w:t>
+                <w:rFonts w:ascii="Calibri" w:hAnsi="Calibri"/>
+                <w:b/>
+                <w:color w:val="B45F3B"/>
+                <w:sz w:val="18"/>
+              </w:rPr>
+              <w:t xml:space="preserve">Discounting + an anti-pattern — </w:t>
+            </w:r>
+            <w:r>
+              <w:rPr>
+                <w:rFonts w:ascii="Calibri" w:hAnsi="Calibri"/>
+                <w:b w:val="0"/>
+                <w:color w:val="2B2B2B"/>
+                <w:sz w:val="18"/>
+              </w:rPr>
+              <w:t>a points rebate with store-only redemption, a friction that hurts in an omnichannel world. DO: the opposite of what to do — make points earn and redeem everywhere.</w:t>
             </w:r>
           </w:p>
         </w:tc>
@@ -17469,12 +17663,21 @@
             </w:pPr>
             <w:r>
               <w:rPr>
-                <w:rFonts w:ascii="Calibri" w:hAnsi="Calibri" w:eastAsia="Calibri" w:cs="Calibri"/>
-                <w:color w:val="2B2B2B"/>
-                <w:sz w:val="18"/>
-                <w:szCs w:val="18"/>
-              </w:rPr>
-              <w:t>Points + referral + birthday perks</w:t>
+                <w:rFonts w:ascii="Calibri" w:hAnsi="Calibri"/>
+                <w:b/>
+                <w:color w:val="B45F3B"/>
+                <w:sz w:val="18"/>
+              </w:rPr>
+              <w:t xml:space="preserve">Thin rebate — </w:t>
+            </w:r>
+            <w:r>
+              <w:rPr>
+                <w:rFonts w:ascii="Calibri" w:hAnsi="Calibri"/>
+                <w:b w:val="0"/>
+                <w:color w:val="2B2B2B"/>
+                <w:sz w:val="18"/>
+              </w:rPr>
+              <w:t>light points + referral + birthday; low differentiation. DO: little to copy — a thin points programme is noise, not a moat.</w:t>
             </w:r>
           </w:p>
         </w:tc>
@@ -17579,12 +17782,21 @@
             </w:pPr>
             <w:r>
               <w:rPr>
-                <w:rFonts w:ascii="Calibri" w:hAnsi="Calibri" w:eastAsia="Calibri" w:cs="Calibri"/>
-                <w:color w:val="2B2B2B"/>
-                <w:sz w:val="18"/>
-                <w:szCs w:val="18"/>
-              </w:rPr>
-              <w:t>“boAthead” tribe identity over a thin points engine</w:t>
+                <w:rFonts w:ascii="Calibri" w:hAnsi="Calibri"/>
+                <w:b/>
+                <w:color w:val="B45F3B"/>
+                <w:sz w:val="18"/>
+              </w:rPr>
+              <w:t xml:space="preserve">Community over points — </w:t>
+            </w:r>
+            <w:r>
+              <w:rPr>
+                <w:rFonts w:ascii="Calibri" w:hAnsi="Calibri"/>
+                <w:b w:val="0"/>
+                <w:color w:val="2B2B2B"/>
+                <w:sz w:val="18"/>
+              </w:rPr>
+              <w:t>the points are minor; the tribe identity is the real, non-discount asset, though under-built. DO: community identity can beat a points ledger for repeat and advocacy — go further with a genuine design community.</w:t>
             </w:r>
           </w:p>
         </w:tc>
@@ -17697,12 +17909,21 @@
             </w:pPr>
             <w:r>
               <w:rPr>
-                <w:rFonts w:ascii="Calibri" w:hAnsi="Calibri" w:eastAsia="Calibri" w:cs="Calibri"/>
-                <w:color w:val="2B2B2B"/>
-                <w:sz w:val="18"/>
-                <w:szCs w:val="18"/>
-              </w:rPr>
-              <w:t>No structured loyalty at all — newsletters, bundles, warranty and community only. This is the whitespace.</w:t>
+                <w:rFonts w:ascii="Calibri" w:hAnsi="Calibri"/>
+                <w:b/>
+                <w:color w:val="B45F3B"/>
+                <w:sz w:val="18"/>
+              </w:rPr>
+              <w:t xml:space="preserve">No programme — the whitespace — </w:t>
+            </w:r>
+            <w:r>
+              <w:rPr>
+                <w:rFonts w:ascii="Calibri" w:hAnsi="Calibri"/>
+                <w:b w:val="0"/>
+                <w:color w:val="2B2B2B"/>
+                <w:sz w:val="18"/>
+              </w:rPr>
+              <w:t>no discounting, but no structured retention either; they lean on product, newsletter and warranty. DO: a well-built, non-discount, community-flavoured programme is a differentiator none of these premium peers have taken.</w:t>
             </w:r>
           </w:p>
         </w:tc>

</xml_diff>

<commit_message>
Add full column key to the master comparison matrix
Define abbreviated columns (Pay, Pts, Tiers, Exp. = experiences/access,
Comm. = community, Omni = omnichannel) and correct the cell legend to
Y/~/- (was mismatched 'N = no')

Co-Authored-By: Claude Opus 4.8 <noreply@anthropic.com>
Claude-Session: https://claude.ai/code/session_01H42f9onhzyUUMa7YSHdZFA
</commit_message>
<xml_diff>
--- a/DailyObjects_Loyalty_Strategy.docx
+++ b/DailyObjects_Loyalty_Strategy.docx
@@ -1920,12 +1920,39 @@
       </w:pPr>
       <w:r>
         <w:rPr>
-          <w:rFonts w:ascii="Calibri" w:hAnsi="Calibri" w:eastAsia="Calibri" w:cs="Calibri"/>
+          <w:rFonts w:ascii="Calibri" w:hAnsi="Calibri"/>
+          <w:b w:val="0"/>
           <w:color w:val="2B2B2B"/>
           <w:sz w:val="21"/>
-          <w:szCs w:val="21"/>
         </w:rPr>
-        <w:t>30 programmes, standardised. Y = yes / strong, ~ = partial / light, N = no. “Diff.” = primary differentiator. This is the map; Sections 5–6 are the territory.</w:t>
+        <w:t xml:space="preserve">30 programmes, standardised — this is the map; the deep-dives in Sections 5–6 are the territory. </w:t>
+      </w:r>
+      <w:r>
+        <w:rPr>
+          <w:rFonts w:ascii="Calibri" w:hAnsi="Calibri"/>
+          <w:b/>
+          <w:color w:val="2B2B2B"/>
+          <w:sz w:val="21"/>
+        </w:rPr>
+        <w:t xml:space="preserve">Column key: </w:t>
+      </w:r>
+      <w:r>
+        <w:rPr>
+          <w:rFonts w:ascii="Calibri" w:hAnsi="Calibri"/>
+          <w:b w:val="0"/>
+          <w:color w:val="2B2B2B"/>
+          <w:sz w:val="21"/>
+        </w:rPr>
+        <w:t xml:space="preserve">Pay = free vs paid membership · Pts = uses a points currency · Tiers = tiered status levels · Exp. = experiences / access rewards (events, early access, launches, workshops) · Comm. = community / belonging layer (forums, events, UGC, tribe identity) · Omni = omnichannel (one identity and benefits online and offline). </w:t>
+      </w:r>
+      <w:r>
+        <w:rPr>
+          <w:rFonts w:ascii="Calibri" w:hAnsi="Calibri"/>
+          <w:b/>
+          <w:color w:val="2B2B2B"/>
+          <w:sz w:val="21"/>
+        </w:rPr>
+        <w:t>Cells: Y = strong · ~ = partial · – = none.</w:t>
       </w:r>
     </w:p>
     <w:tbl>

</xml_diff>